<commit_message>
feat(document-engine): correct Romanian in the four decisions
A shared wording pass restores diacritics word by word, fixes the originals'
typos, spacing and old cedilla letters, and rewords the sentences that were
only right for one person. The engine drops the doubled full stop a company
name can leave at the end of a sentence.

Claude-Session: https://claude.ai/code/session_019fFLd3rEWZKkUNU1RuQAwk
</commit_message>
<xml_diff>
--- a/packages/document-engine/templates/decision_first_aid.docx
+++ b/packages/document-engine/templates/decision_first_aid.docx
@@ -41,7 +41,7 @@
           <w:sz w:val="20"/>
           <w:szCs w:val="20"/>
         </w:rPr>
-        <w:t xml:space="preserve">Nr. : {{decisionNumber}} SSM  Din : {{issueDate}}</w:t>
+        <w:t xml:space="preserve">Nr.: {{decisionNumber}} SSM Din: {{issueDate}}</w:t>
       </w:r>
     </w:p>
     <w:p>
@@ -81,7 +81,7 @@
           <w:sz w:val="20"/>
           <w:szCs w:val="20"/>
         </w:rPr>
-        <w:t xml:space="preserve">În baza prevederilor legale in domeniul securitatii si sanatatii in munca din </w:t>
+        <w:t xml:space="preserve">În baza prevederilor legale în domeniul securității și sănătății în muncă din </w:t>
       </w:r>
       <w:r>
         <w:rPr>
@@ -90,15 +90,15 @@
           <w:sz w:val="20"/>
           <w:szCs w:val="20"/>
         </w:rPr>
-        <w:t xml:space="preserve"> Legea 319/ 2006 Art. 10, alin. (1), alin. (2), {{client.representativeName}} in calitate de {{client.representativeRole}}</w:t>
-      </w:r>
-      <w:r>
-        <w:rPr>
-          <w:rFonts w:cs="Arial" w:ascii="Arial" w:hAnsi="Arial"/>
-          <w:sz w:val="20"/>
-          <w:szCs w:val="20"/>
-        </w:rPr>
-        <w:t xml:space="preserve"> in cadrul {{client.legalName}}</w:t>
+        <w:t xml:space="preserve">Legea 319/ 2006 Art. 10, alin. (1), alin. (2), {{client.representativeName}} în calitate de {{client.representativeRole}}</w:t>
+      </w:r>
+      <w:r>
+        <w:rPr>
+          <w:rFonts w:cs="Arial" w:ascii="Arial" w:hAnsi="Arial"/>
+          <w:sz w:val="20"/>
+          <w:szCs w:val="20"/>
+        </w:rPr>
+        <w:t xml:space="preserve"> în cadrul {{client.legalName}}</w:t>
       </w:r>
       <w:r>
         <w:rPr>
@@ -154,7 +154,7 @@
           <w:sz w:val="20"/>
           <w:szCs w:val="20"/>
         </w:rPr>
-        <w:t>DECIDE :</w:t>
+        <w:t xml:space="preserve">DECIDE:</w:t>
       </w:r>
     </w:p>
     <w:p>
@@ -213,7 +213,7 @@
           <w:sz w:val="20"/>
           <w:szCs w:val="20"/>
         </w:rPr>
-        <w:t xml:space="preserve">, se va realiza de catre : </w:t>
+        <w:t xml:space="preserve">, se va realiza de către: </w:t>
       </w:r>
     </w:p>
     <w:p>
@@ -241,7 +241,7 @@
           <w:sz w:val="20"/>
           <w:szCs w:val="20"/>
         </w:rPr>
-        <w:t xml:space="preserve">{{name}} avand functia de {{jobTitle}} in cadrul {{client.legalName}}</w:t>
+        <w:t xml:space="preserve">{{name}} având funcția de {{jobTitle}} în cadrul {{client.legalName}}</w:t>
       </w:r>
       <w:r>
         <w:rPr>
@@ -304,7 +304,7 @@
           <w:sz w:val="20"/>
           <w:szCs w:val="20"/>
         </w:rPr>
-        <w:t>Persoana sau persoanele desemnate prin prezenta decizie vor fi instruite suplimentar cu privire la modul de acordare a primului ajutor .</w:t>
+        <w:t xml:space="preserve">Persoana sau persoanele desemnate prin prezenta decizie vor fi instruite suplimentar cu privire la modul de acordare a primului ajutor.</w:t>
       </w:r>
     </w:p>
     <w:p>
@@ -345,7 +345,7 @@
           <w:sz w:val="20"/>
           <w:szCs w:val="20"/>
         </w:rPr>
-        <w:t>Atributiile persoanelor responsabile si cu aplicarea măsurilor de prim ajutor vor fi prezentate in fisa postului si vor fi tratate cu maxima seriozitate.</w:t>
+        <w:t xml:space="preserve">Atribuțiile persoanelor responsabile și cu aplicarea măsurilor de prim ajutor vor fi prezentate în fișa postului și vor fi tratate cu maximă seriozitate.</w:t>
       </w:r>
     </w:p>
     <w:p>
@@ -537,7 +537,7 @@
           <w:sz w:val="20"/>
           <w:szCs w:val="20"/>
         </w:rPr>
-        <w:t xml:space="preserve">{{client.representativeRole}} :</w:t>
+        <w:t xml:space="preserve">{{client.representativeRole}}:</w:t>
       </w:r>
     </w:p>
     <w:p>
@@ -706,7 +706,7 @@
           <w:szCs w:val="20"/>
           <w:lang w:val="fr-FR"/>
         </w:rPr>
-        <w:t>PROCES VERBAL DE LUARE LA CUNOSTINTA</w:t>
+        <w:t xml:space="preserve">PROCES VERBAL DE LUARE LA CUNOȘTINȚĂ</w:t>
       </w:r>
     </w:p>
     <w:p>
@@ -730,7 +730,7 @@
           <w:szCs w:val="20"/>
           <w:lang w:val="fr-FR"/>
         </w:rPr>
-        <w:t xml:space="preserve">Subsemnatii am luat cunoştinţă şi am consemnat în tabelului nominal</w:t>
+        <w:t xml:space="preserve">Prin semnătura din tabelul nominal de mai jos, fiecare persoană desemnată confirmă că a luat cunoștință de prezenta decizie și se obligă să respecte întocmai obligațiile, atribuțiile și răspunderile ce reies din decizia</w:t>
       </w:r>
       <w:r>
         <w:rPr>
@@ -739,7 +739,7 @@
           <w:szCs w:val="20"/>
           <w:lang w:val="fr-FR"/>
         </w:rPr>
-        <w:t xml:space="preserve"> </w:t>
+        <w:t xml:space="preserve"/>
       </w:r>
       <w:r>
         <w:rPr>
@@ -749,7 +749,7 @@
           <w:szCs w:val="20"/>
           <w:lang w:val="fr-FR"/>
         </w:rPr>
-        <w:t xml:space="preserve">de luarea la cunostinta şi ne obligăm să respectăm întocmai obligatiile, atributiile si raspunderile ce reies din decizia Nr. {{decisionNumber}} SSM din </w:t>
+        <w:t xml:space="preserve"> Nr. {{decisionNumber}} SSM din </w:t>
       </w:r>
       <w:r>
         <w:rPr>
@@ -866,7 +866,7 @@
                 <w:sz w:val="20"/>
                 <w:szCs w:val="20"/>
               </w:rPr>
-              <w:t>Numele si prenumele</w:t>
+              <w:t xml:space="preserve">Numele și prenumele</w:t>
             </w:r>
           </w:p>
         </w:tc>
@@ -900,7 +900,7 @@
                 <w:sz w:val="20"/>
                 <w:szCs w:val="20"/>
               </w:rPr>
-              <w:t>Functia</w:t>
+              <w:t xml:space="preserve">Funcția</w:t>
             </w:r>
           </w:p>
         </w:tc>
@@ -968,7 +968,7 @@
                 <w:sz w:val="20"/>
                 <w:szCs w:val="20"/>
               </w:rPr>
-              <w:t>Semnatura primire</w:t>
+              <w:t xml:space="preserve">Semnătura de primire</w:t>
             </w:r>
           </w:p>
         </w:tc>
@@ -1756,7 +1756,7 @@
           <w:sz w:val="20"/>
           <w:szCs w:val="20"/>
         </w:rPr>
-        <w:t xml:space="preserve">Incheiat azi {{issueDate}}, in cadrul {{client.legalName}} cu ocazia instruirii persoanelor: </w:t>
+        <w:t xml:space="preserve">Încheiat azi {{issueDate}}, în cadrul {{client.legalName}} cu ocazia instruirii suplimentare a următoarelor persoane: </w:t>
       </w:r>
     </w:p>
     <w:p>
@@ -1781,7 +1781,7 @@
           <w:sz w:val="20"/>
           <w:szCs w:val="20"/>
         </w:rPr>
-        <w:t xml:space="preserve">{{firstAiderNames}}, care urmeaza să acorde primul ajutor precum si masurile de prevenire si stingere a incendiilor. Aceștia au  fost instruiți suplimentar de către conducatorul serviciului extern {{provider.legalName}} – {{provider.representativeName}}.</w:t>
+        <w:t xml:space="preserve">{{firstAiderNames}}, desemnate să acorde primul ajutor și să aplice măsurile de prevenire și stingere a incendiilor. Instruirea suplimentară a fost efectuată de către conducătorul serviciului extern {{provider.legalName}} – {{provider.representativeName}}.</w:t>
       </w:r>
     </w:p>
     <w:p>
@@ -1941,7 +1941,7 @@
                 <w:sz w:val="20"/>
                 <w:szCs w:val="20"/>
               </w:rPr>
-              <w:t>Numele si prenumele</w:t>
+              <w:t xml:space="preserve">Numele și prenumele</w:t>
             </w:r>
           </w:p>
         </w:tc>
@@ -1975,7 +1975,7 @@
                 <w:sz w:val="20"/>
                 <w:szCs w:val="20"/>
               </w:rPr>
-              <w:t>Functia</w:t>
+              <w:t xml:space="preserve">Funcția</w:t>
             </w:r>
           </w:p>
         </w:tc>
@@ -2043,7 +2043,7 @@
                 <w:sz w:val="20"/>
                 <w:szCs w:val="20"/>
               </w:rPr>
-              <w:t>Semnatura primire</w:t>
+              <w:t xml:space="preserve">Semnătura de primire</w:t>
             </w:r>
           </w:p>
         </w:tc>

</xml_diff>